<commit_message>
Semester 1 Week 04: learning path, notebook explanations, slide and sheet fixes
- README: ordered learning path with PDF pages, prerequisites, outcomes,
  answers table, staff notes (corrections, PowerPoint re-export, MATLAB alpha)
- 7 notebooks, text and comments only: opening cell, explanation above each
  code cell, constraint comments, What do you notice / Try it with answers;
  no code or printed result changed
- lecture .pptx: diet constraints (14x5, 10x9), alpha < 1/6 (was 0.17),
  at least / at most, ratio heading, Q6a numbering, typos
- Slack Variables .pptx: P = 5*0 + 4*0; <= / >= wording
- tutorial/answers .docx: at least / at most, typos, course-site link,
  slack wording, Q1b results table

Co-Authored-By: Claude Opus 5.5 <noreply@anthropic.com>
Claude-Session: https://claude.ai/code/session_01MvNKmqjaG26DoWDSRmZHTm

[skip ci]
</commit_message>
<xml_diff>
--- a/content/Lectures/Semester 1/Week 04 - Mathematical Programming - Modelling/5 Source Files/Week 4 - Mathematical Programming - Modelling - Tutorial - Answers.docx
+++ b/content/Lectures/Semester 1/Week 04 - Mathematical Programming - Modelling/5 Source Files/Week 4 - Mathematical Programming - Modelling - Tutorial - Answers.docx
@@ -32,16 +32,19 @@
     </w:p>
     <w:p>
       <w:r>
-        <w:t xml:space="preserve">Coded Answers - </w:t>
+        <w:t xml:space="preserve">Answer notebooks - </w:t>
       </w:r>
       <w:hyperlink r:id="rId11" w:history="1">
         <w:r>
           <w:rPr>
             <w:rStyle w:val="Hyperlink"/>
           </w:rPr>
-          <w:t>https://colab.research.google.com/drive/1j7lUm7iyIJR3IEdHodRvMCB6sc65ZQOe?usp=sharing</w:t>
+          <w:t>https://invariantum.github.io/operational_research/</w:t>
         </w:r>
       </w:hyperlink>
+      <w:r>
+        <w:t xml:space="preserve"> → Lectures → Semester 1 → Week 04 - Mathematical Programming - Modelling → 4 Tutorial Answers</w:t>
+      </w:r>
     </w:p>
     <w:p>
       <w:pPr>
@@ -104,7 +107,7 @@
         </w:numPr>
       </w:pPr>
       <w:r>
-        <w:t xml:space="preserve">The selection chosen must weigh more than 320g </w:t>
+        <w:t xml:space="preserve">The selection chosen must weigh at least 320g </w:t>
       </w:r>
     </w:p>
     <w:p>
@@ -116,7 +119,7 @@
         </w:numPr>
       </w:pPr>
       <w:r>
-        <w:t>Total fat content by weight must be less than 45% of the total weight of the selection.</w:t>
+        <w:t>Total fat content by weight must be at most 45% of the total weight of the selection.</w:t>
       </w:r>
     </w:p>
     <w:p>
@@ -128,7 +131,7 @@
         </w:numPr>
       </w:pPr>
       <w:r>
-        <w:t>Calorific value of the selection must be less than 2850 calories.</w:t>
+        <w:t>Calorific value of the selection must be at most 2850 calories.</w:t>
       </w:r>
     </w:p>
     <w:p>
@@ -200,7 +203,7 @@
         <w:rPr>
           <w:highlight w:val="yellow"/>
         </w:rPr>
-        <w:t>Introduce the following constraint into last weeks model</w:t>
+        <w:t>Introduce the following constraint into last week’s model</w:t>
       </w:r>
     </w:p>
     <w:p>
@@ -3428,13 +3431,517 @@
         <w:rPr>
           <w:highlight w:val="yellow"/>
         </w:rPr>
-        <w:t>Pyomo code in Google Colab</w:t>
-      </w:r>
-      <w:r>
-        <w:rPr>
-          <w:highlight w:val="yellow"/>
-        </w:rPr>
-        <w:t>. You have many possible choices. I have implemented a weighted objective, weighted norm objective and a population per cost ratio objective. These are all from the lecture slides!</w:t>
+        <w:t>answer notebooks on the course site (4 Tutorial Answers)</w:t>
+      </w:r>
+      <w:r>
+        <w:rPr>
+          <w:highlight w:val="yellow"/>
+        </w:rPr>
+        <w:t>. You have many possible choices. I have implemented a weighted objective, a normalised weighted objective and a popularity per cost ratio objective. These are all from the lecture slides!</w:t>
+      </w:r>
+    </w:p>
+    <w:p>
+      <w:r>
+        <w:rPr>
+          <w:highlight w:val="yellow"/>
+        </w:rPr>
+        <w:t xml:space="preserve">With the weight cap, the answer notebooks give these selections:</w:t>
+      </w:r>
+    </w:p>
+    <w:tbl>
+      <w:tblPr>
+        <w:tblStyle w:val="GridTable1Light"/>
+        <w:tblW w:w="8750" w:type="dxa"/>
+        <w:jc w:val="center"/>
+        <w:tblLook w:val="04A0" w:firstRow="1" w:lastRow="0" w:firstColumn="1" w:lastColumn="0" w:noHBand="0" w:noVBand="1"/>
+      </w:tblPr>
+      <w:tblGrid>
+        <w:gridCol w:w="2350"/>
+        <w:gridCol w:w="3400"/>
+        <w:gridCol w:w="1000"/>
+        <w:gridCol w:w="700"/>
+        <w:gridCol w:w="1300"/>
+      </w:tblGrid>
+      <w:tr>
+        <w:tc>
+          <w:tcPr>
+            <w:tcW w:w="2350" w:type="dxa"/>
+          </w:tcPr>
+          <w:p>
+            <w:pPr/>
+            <w:r>
+              <w:rPr>
+                <w:rFonts w:ascii="Calibri" w:eastAsia="Times New Roman" w:hAnsi="Calibri" w:cs="Times New Roman"/>
+                <w:b/>
+                <w:color w:val="000000"/>
+                <w:highlight w:val="yellow"/>
+                <w:lang w:eastAsia="en-GB"/>
+              </w:rPr>
+              <w:t xml:space="preserve">Objective</w:t>
+            </w:r>
+          </w:p>
+        </w:tc>
+        <w:tc>
+          <w:tcPr>
+            <w:tcW w:w="3400" w:type="dxa"/>
+          </w:tcPr>
+          <w:p>
+            <w:pPr/>
+            <w:r>
+              <w:rPr>
+                <w:rFonts w:ascii="Calibri" w:eastAsia="Times New Roman" w:hAnsi="Calibri" w:cs="Times New Roman"/>
+                <w:b/>
+                <w:color w:val="000000"/>
+                <w:highlight w:val="yellow"/>
+                <w:lang w:eastAsia="en-GB"/>
+              </w:rPr>
+              <w:t xml:space="preserve">Selection</w:t>
+            </w:r>
+          </w:p>
+        </w:tc>
+        <w:tc>
+          <w:tcPr>
+            <w:tcW w:w="1000" w:type="dxa"/>
+          </w:tcPr>
+          <w:p>
+            <w:pPr>
+              <w:jc w:val="center"/>
+            </w:pPr>
+            <w:r>
+              <w:rPr>
+                <w:rFonts w:ascii="Calibri" w:eastAsia="Times New Roman" w:hAnsi="Calibri" w:cs="Times New Roman"/>
+                <w:b/>
+                <w:color w:val="000000"/>
+                <w:highlight w:val="yellow"/>
+                <w:lang w:eastAsia="en-GB"/>
+              </w:rPr>
+              <w:t xml:space="preserve">Weight (g)</w:t>
+            </w:r>
+          </w:p>
+        </w:tc>
+        <w:tc>
+          <w:tcPr>
+            <w:tcW w:w="700" w:type="dxa"/>
+          </w:tcPr>
+          <w:p>
+            <w:pPr>
+              <w:jc w:val="center"/>
+            </w:pPr>
+            <w:r>
+              <w:rPr>
+                <w:rFonts w:ascii="Calibri" w:eastAsia="Times New Roman" w:hAnsi="Calibri" w:cs="Times New Roman"/>
+                <w:b/>
+                <w:color w:val="000000"/>
+                <w:highlight w:val="yellow"/>
+                <w:lang w:eastAsia="en-GB"/>
+              </w:rPr>
+              <w:t xml:space="preserve">Cost</w:t>
+            </w:r>
+          </w:p>
+        </w:tc>
+        <w:tc>
+          <w:tcPr>
+            <w:tcW w:w="1300" w:type="dxa"/>
+          </w:tcPr>
+          <w:p>
+            <w:pPr>
+              <w:jc w:val="center"/>
+            </w:pPr>
+            <w:r>
+              <w:rPr>
+                <w:rFonts w:ascii="Calibri" w:eastAsia="Times New Roman" w:hAnsi="Calibri" w:cs="Times New Roman"/>
+                <w:b/>
+                <w:color w:val="000000"/>
+                <w:highlight w:val="yellow"/>
+                <w:lang w:eastAsia="en-GB"/>
+              </w:rPr>
+              <w:t xml:space="preserve">Popularity</w:t>
+            </w:r>
+          </w:p>
+        </w:tc>
+      </w:tr>
+      <w:tr>
+        <w:tc>
+          <w:tcPr>
+            <w:tcW w:w="2350" w:type="dxa"/>
+          </w:tcPr>
+          <w:p>
+            <w:pPr/>
+            <w:r>
+              <w:rPr>
+                <w:rFonts w:ascii="Calibri" w:eastAsia="Times New Roman" w:hAnsi="Calibri" w:cs="Times New Roman"/>
+                <w:color w:val="000000"/>
+                <w:highlight w:val="yellow"/>
+                <w:lang w:eastAsia="en-GB"/>
+              </w:rPr>
+              <w:t xml:space="preserve">Popularity per cost, Σ(Pᵢ/Cᵢ)xᵢ</w:t>
+            </w:r>
+          </w:p>
+        </w:tc>
+        <w:tc>
+          <w:tcPr>
+            <w:tcW w:w="3400" w:type="dxa"/>
+          </w:tcPr>
+          <w:p>
+            <w:pPr/>
+            <w:r>
+              <w:rPr>
+                <w:rFonts w:ascii="Calibri" w:eastAsia="Times New Roman" w:hAnsi="Calibri" w:cs="Times New Roman"/>
+                <w:color w:val="000000"/>
+                <w:highlight w:val="yellow"/>
+                <w:lang w:eastAsia="en-GB"/>
+              </w:rPr>
+              <w:t xml:space="preserve">8 Coconut Ice, 32 Lime sherbet, 8 Rose-water posy</w:t>
+            </w:r>
+          </w:p>
+        </w:tc>
+        <w:tc>
+          <w:tcPr>
+            <w:tcW w:w="1000" w:type="dxa"/>
+          </w:tcPr>
+          <w:p>
+            <w:pPr>
+              <w:jc w:val="center"/>
+            </w:pPr>
+            <w:r>
+              <w:rPr>
+                <w:rFonts w:ascii="Calibri" w:eastAsia="Times New Roman" w:hAnsi="Calibri" w:cs="Times New Roman"/>
+                <w:color w:val="000000"/>
+                <w:highlight w:val="yellow"/>
+                <w:lang w:eastAsia="en-GB"/>
+              </w:rPr>
+              <w:t xml:space="preserve">480</w:t>
+            </w:r>
+          </w:p>
+        </w:tc>
+        <w:tc>
+          <w:tcPr>
+            <w:tcW w:w="700" w:type="dxa"/>
+          </w:tcPr>
+          <w:p>
+            <w:pPr>
+              <w:jc w:val="center"/>
+            </w:pPr>
+            <w:r>
+              <w:rPr>
+                <w:rFonts w:ascii="Calibri" w:eastAsia="Times New Roman" w:hAnsi="Calibri" w:cs="Times New Roman"/>
+                <w:color w:val="000000"/>
+                <w:highlight w:val="yellow"/>
+                <w:lang w:eastAsia="en-GB"/>
+              </w:rPr>
+              <w:t xml:space="preserve">616</w:t>
+            </w:r>
+          </w:p>
+        </w:tc>
+        <w:tc>
+          <w:tcPr>
+            <w:tcW w:w="1300" w:type="dxa"/>
+          </w:tcPr>
+          <w:p>
+            <w:pPr>
+              <w:jc w:val="center"/>
+            </w:pPr>
+            <w:r>
+              <w:rPr>
+                <w:rFonts w:ascii="Calibri" w:eastAsia="Times New Roman" w:hAnsi="Calibri" w:cs="Times New Roman"/>
+                <w:color w:val="000000"/>
+                <w:highlight w:val="yellow"/>
+                <w:lang w:eastAsia="en-GB"/>
+              </w:rPr>
+              <w:t xml:space="preserve">288</w:t>
+            </w:r>
+          </w:p>
+        </w:tc>
+      </w:tr>
+      <w:tr>
+        <w:tc>
+          <w:tcPr>
+            <w:tcW w:w="2350" w:type="dxa"/>
+          </w:tcPr>
+          <w:p>
+            <w:pPr/>
+            <w:r>
+              <w:rPr>
+                <w:rFonts w:ascii="Calibri" w:eastAsia="Times New Roman" w:hAnsi="Calibri" w:cs="Times New Roman"/>
+                <w:color w:val="000000"/>
+                <w:highlight w:val="yellow"/>
+                <w:lang w:eastAsia="en-GB"/>
+              </w:rPr>
+              <w:t xml:space="preserve">Weighted, α = 0</w:t>
+            </w:r>
+          </w:p>
+        </w:tc>
+        <w:tc>
+          <w:tcPr>
+            <w:tcW w:w="3400" w:type="dxa"/>
+          </w:tcPr>
+          <w:p>
+            <w:pPr/>
+            <w:r>
+              <w:rPr>
+                <w:rFonts w:ascii="Calibri" w:eastAsia="Times New Roman" w:hAnsi="Calibri" w:cs="Times New Roman"/>
+                <w:color w:val="000000"/>
+                <w:highlight w:val="yellow"/>
+                <w:lang w:eastAsia="en-GB"/>
+              </w:rPr>
+              <w:t xml:space="preserve">30 Coconut Ice, 5 Rose-water posy, 5 Grape bunch *</w:t>
+            </w:r>
+          </w:p>
+        </w:tc>
+        <w:tc>
+          <w:tcPr>
+            <w:tcW w:w="1000" w:type="dxa"/>
+          </w:tcPr>
+          <w:p>
+            <w:pPr>
+              <w:jc w:val="center"/>
+            </w:pPr>
+            <w:r>
+              <w:rPr>
+                <w:rFonts w:ascii="Calibri" w:eastAsia="Times New Roman" w:hAnsi="Calibri" w:cs="Times New Roman"/>
+                <w:color w:val="000000"/>
+                <w:highlight w:val="yellow"/>
+                <w:lang w:eastAsia="en-GB"/>
+              </w:rPr>
+              <w:t xml:space="preserve">475</w:t>
+            </w:r>
+          </w:p>
+        </w:tc>
+        <w:tc>
+          <w:tcPr>
+            <w:tcW w:w="700" w:type="dxa"/>
+          </w:tcPr>
+          <w:p>
+            <w:pPr>
+              <w:jc w:val="center"/>
+            </w:pPr>
+            <w:r>
+              <w:rPr>
+                <w:rFonts w:ascii="Calibri" w:eastAsia="Times New Roman" w:hAnsi="Calibri" w:cs="Times New Roman"/>
+                <w:color w:val="000000"/>
+                <w:highlight w:val="yellow"/>
+                <w:lang w:eastAsia="en-GB"/>
+              </w:rPr>
+              <w:t xml:space="preserve">600</w:t>
+            </w:r>
+          </w:p>
+        </w:tc>
+        <w:tc>
+          <w:tcPr>
+            <w:tcW w:w="1300" w:type="dxa"/>
+          </w:tcPr>
+          <w:p>
+            <w:pPr>
+              <w:jc w:val="center"/>
+            </w:pPr>
+            <w:r>
+              <w:rPr>
+                <w:rFonts w:ascii="Calibri" w:eastAsia="Times New Roman" w:hAnsi="Calibri" w:cs="Times New Roman"/>
+                <w:color w:val="000000"/>
+                <w:highlight w:val="yellow"/>
+                <w:lang w:eastAsia="en-GB"/>
+              </w:rPr>
+              <w:t xml:space="preserve">305</w:t>
+            </w:r>
+          </w:p>
+        </w:tc>
+      </w:tr>
+      <w:tr>
+        <w:tc>
+          <w:tcPr>
+            <w:tcW w:w="2350" w:type="dxa"/>
+          </w:tcPr>
+          <w:p>
+            <w:pPr/>
+            <w:r>
+              <w:rPr>
+                <w:rFonts w:ascii="Calibri" w:eastAsia="Times New Roman" w:hAnsi="Calibri" w:cs="Times New Roman"/>
+                <w:color w:val="000000"/>
+                <w:highlight w:val="yellow"/>
+                <w:lang w:eastAsia="en-GB"/>
+              </w:rPr>
+              <w:t xml:space="preserve">Normalised weighted, α = 0.5</w:t>
+            </w:r>
+          </w:p>
+        </w:tc>
+        <w:tc>
+          <w:tcPr>
+            <w:tcW w:w="3400" w:type="dxa"/>
+          </w:tcPr>
+          <w:p>
+            <w:pPr/>
+            <w:r>
+              <w:rPr>
+                <w:rFonts w:ascii="Calibri" w:eastAsia="Times New Roman" w:hAnsi="Calibri" w:cs="Times New Roman"/>
+                <w:color w:val="000000"/>
+                <w:highlight w:val="yellow"/>
+                <w:lang w:eastAsia="en-GB"/>
+              </w:rPr>
+              <w:t xml:space="preserve">24 Coconut Ice, 11 Rose-water posy</w:t>
+            </w:r>
+          </w:p>
+        </w:tc>
+        <w:tc>
+          <w:tcPr>
+            <w:tcW w:w="1000" w:type="dxa"/>
+          </w:tcPr>
+          <w:p>
+            <w:pPr>
+              <w:jc w:val="center"/>
+            </w:pPr>
+            <w:r>
+              <w:rPr>
+                <w:rFonts w:ascii="Calibri" w:eastAsia="Times New Roman" w:hAnsi="Calibri" w:cs="Times New Roman"/>
+                <w:color w:val="000000"/>
+                <w:highlight w:val="yellow"/>
+                <w:lang w:eastAsia="en-GB"/>
+              </w:rPr>
+              <w:t xml:space="preserve">376</w:t>
+            </w:r>
+          </w:p>
+        </w:tc>
+        <w:tc>
+          <w:tcPr>
+            <w:tcW w:w="700" w:type="dxa"/>
+          </w:tcPr>
+          <w:p>
+            <w:pPr>
+              <w:jc w:val="center"/>
+            </w:pPr>
+            <w:r>
+              <w:rPr>
+                <w:rFonts w:ascii="Calibri" w:eastAsia="Times New Roman" w:hAnsi="Calibri" w:cs="Times New Roman"/>
+                <w:color w:val="000000"/>
+                <w:highlight w:val="yellow"/>
+                <w:lang w:eastAsia="en-GB"/>
+              </w:rPr>
+              <w:t xml:space="preserve">470</w:t>
+            </w:r>
+          </w:p>
+        </w:tc>
+        <w:tc>
+          <w:tcPr>
+            <w:tcW w:w="1300" w:type="dxa"/>
+          </w:tcPr>
+          <w:p>
+            <w:pPr>
+              <w:jc w:val="center"/>
+            </w:pPr>
+            <w:r>
+              <w:rPr>
+                <w:rFonts w:ascii="Calibri" w:eastAsia="Times New Roman" w:hAnsi="Calibri" w:cs="Times New Roman"/>
+                <w:color w:val="000000"/>
+                <w:highlight w:val="yellow"/>
+                <w:lang w:eastAsia="en-GB"/>
+              </w:rPr>
+              <w:t xml:space="preserve">249</w:t>
+            </w:r>
+          </w:p>
+        </w:tc>
+      </w:tr>
+      <w:tr>
+        <w:tc>
+          <w:tcPr>
+            <w:tcW w:w="2350" w:type="dxa"/>
+          </w:tcPr>
+          <w:p>
+            <w:pPr/>
+            <w:r>
+              <w:rPr>
+                <w:rFonts w:ascii="Calibri" w:eastAsia="Times New Roman" w:hAnsi="Calibri" w:cs="Times New Roman"/>
+                <w:color w:val="000000"/>
+                <w:highlight w:val="yellow"/>
+                <w:lang w:eastAsia="en-GB"/>
+              </w:rPr>
+              <w:t xml:space="preserve">Normalised weighted, α = 0.59</w:t>
+            </w:r>
+          </w:p>
+        </w:tc>
+        <w:tc>
+          <w:tcPr>
+            <w:tcW w:w="3400" w:type="dxa"/>
+          </w:tcPr>
+          <w:p>
+            <w:pPr/>
+            <w:r>
+              <w:rPr>
+                <w:rFonts w:ascii="Calibri" w:eastAsia="Times New Roman" w:hAnsi="Calibri" w:cs="Times New Roman"/>
+                <w:color w:val="000000"/>
+                <w:highlight w:val="yellow"/>
+                <w:lang w:eastAsia="en-GB"/>
+              </w:rPr>
+              <w:t xml:space="preserve">9 Caramel softie, 10 Rose-water posy, 3 Grape bunch</w:t>
+            </w:r>
+          </w:p>
+        </w:tc>
+        <w:tc>
+          <w:tcPr>
+            <w:tcW w:w="1000" w:type="dxa"/>
+          </w:tcPr>
+          <w:p>
+            <w:pPr>
+              <w:jc w:val="center"/>
+            </w:pPr>
+            <w:r>
+              <w:rPr>
+                <w:rFonts w:ascii="Calibri" w:eastAsia="Times New Roman" w:hAnsi="Calibri" w:cs="Times New Roman"/>
+                <w:color w:val="000000"/>
+                <w:highlight w:val="yellow"/>
+                <w:lang w:eastAsia="en-GB"/>
+              </w:rPr>
+              <w:t xml:space="preserve">323</w:t>
+            </w:r>
+          </w:p>
+        </w:tc>
+        <w:tc>
+          <w:tcPr>
+            <w:tcW w:w="700" w:type="dxa"/>
+          </w:tcPr>
+          <w:p>
+            <w:pPr>
+              <w:jc w:val="center"/>
+            </w:pPr>
+            <w:r>
+              <w:rPr>
+                <w:rFonts w:ascii="Calibri" w:eastAsia="Times New Roman" w:hAnsi="Calibri" w:cs="Times New Roman"/>
+                <w:color w:val="000000"/>
+                <w:highlight w:val="yellow"/>
+                <w:lang w:eastAsia="en-GB"/>
+              </w:rPr>
+              <w:t xml:space="preserve">268</w:t>
+            </w:r>
+          </w:p>
+        </w:tc>
+        <w:tc>
+          <w:tcPr>
+            <w:tcW w:w="1300" w:type="dxa"/>
+          </w:tcPr>
+          <w:p>
+            <w:pPr>
+              <w:jc w:val="center"/>
+            </w:pPr>
+            <w:r>
+              <w:rPr>
+                <w:rFonts w:ascii="Calibri" w:eastAsia="Times New Roman" w:hAnsi="Calibri" w:cs="Times New Roman"/>
+                <w:color w:val="000000"/>
+                <w:highlight w:val="yellow"/>
+                <w:lang w:eastAsia="en-GB"/>
+              </w:rPr>
+              <w:t xml:space="preserve">132</w:t>
+            </w:r>
+          </w:p>
+        </w:tc>
+      </w:tr>
+    </w:tbl>
+    <w:p>
+      <w:pPr>
+        <w:spacing w:before="160"/>
+      </w:pPr>
+      <w:r>
+        <w:rPr>
+          <w:highlight w:val="yellow"/>
+        </w:rPr>
+        <w:t xml:space="preserve">* Other selections also reach popularity 305. Any α from about 0.59 upwards gives the minimum-cost selection (cost 268); any α below 1/6 ≈ 0.167 gives the maximum-popularity selection (305). The popularity-per-cost objective adds up each candy’s own ratio, so the selection’s total popularity ÷ total cost (288/616 = 0.47) is not the highest possible.</w:t>
       </w:r>
     </w:p>
     <w:p/>
@@ -3524,7 +4031,7 @@
         <w:t>Each factory uses two processes</w:t>
       </w:r>
       <w:r>
-        <w:t xml:space="preserve">, grinding and polishing, for producing it’s products. Factory A has a grinding capacity of </w:t>
+        <w:t xml:space="preserve">, grinding and polishing, for producing its products. Factory A has a grinding capacity of </w:t>
       </w:r>
       <w:r>
         <w:t xml:space="preserve">80 hours per week and polishing capacity of 60 hours per week. Factory B has a grinding capacity of </w:t>
@@ -3982,7 +4489,7 @@
         <w:rPr>
           <w:b/>
         </w:rPr>
-        <w:t>each factory to maximise the factories profit.</w:t>
+        <w:t>each factory to maximise its profit.</w:t>
       </w:r>
     </w:p>
     <w:p>
@@ -4860,7 +5367,7 @@
           <w:b/>
           <w:bCs/>
         </w:rPr>
-        <w:t>.</w:t>
+        <w:t>.)</w:t>
       </w:r>
     </w:p>
     <w:p>
@@ -4881,7 +5388,7 @@
           <w:highlight w:val="yellow"/>
           <w:u w:val="single"/>
         </w:rPr>
-        <w:t>Factory A Surplus</w:t>
+        <w:t>Factory A Slack (unused hours)</w:t>
       </w:r>
     </w:p>
     <w:p>
@@ -4897,7 +5404,7 @@
         <w:rPr>
           <w:highlight w:val="yellow"/>
         </w:rPr>
-        <w:t xml:space="preserve">Calculate the surplus values by inputting the solution </w:t>
+        <w:t xml:space="preserve">Calculate the slack values by inputting the solution </w:t>
       </w:r>
       <m:oMath>
         <m:r>
@@ -5092,7 +5599,7 @@
         <w:rPr>
           <w:highlight w:val="yellow"/>
         </w:rPr>
-        <w:t>Therefore the surplus for grind and polish is:</w:t>
+        <w:t>Therefore the slack (unused hours) for grind and polish is:</w:t>
       </w:r>
     </w:p>
     <w:p>
@@ -5121,7 +5628,7 @@
           <w:highlight w:val="yellow"/>
         </w:rPr>
         <w:tab/>
-        <w:t>(grind surplus)</w:t>
+        <w:t>(grind slack)</w:t>
       </w:r>
       <w:r>
         <w:rPr>
@@ -5166,7 +5673,7 @@
           <w:bCs/>
           <w:highlight w:val="yellow"/>
         </w:rPr>
-        <w:t xml:space="preserve"> surplus</w:t>
+        <w:t xml:space="preserve"> slack</w:t>
       </w:r>
       <w:r>
         <w:rPr>
@@ -5206,7 +5713,7 @@
           <w:highlight w:val="yellow"/>
           <w:u w:val="single"/>
         </w:rPr>
-        <w:t>Factory B Surplus</w:t>
+        <w:t>Factory B Slack (unused hours)</w:t>
       </w:r>
     </w:p>
     <w:p>
@@ -5222,7 +5729,7 @@
         <w:rPr>
           <w:highlight w:val="yellow"/>
         </w:rPr>
-        <w:t xml:space="preserve">Calculate the surplus values by inputting the solution </w:t>
+        <w:t xml:space="preserve">Calculate the slack values by inputting the solution </w:t>
       </w:r>
       <m:oMath>
         <m:r>
@@ -5354,7 +5861,7 @@
         <w:rPr>
           <w:highlight w:val="yellow"/>
         </w:rPr>
-        <w:t>Therefore the surplus for grind and polish is:</w:t>
+        <w:t>Therefore the slack (unused hours) for grind and polish is:</w:t>
       </w:r>
     </w:p>
     <w:p>
@@ -5383,7 +5890,7 @@
           <w:highlight w:val="yellow"/>
         </w:rPr>
         <w:tab/>
-        <w:t>(grind surplus)</w:t>
+        <w:t>(grind slack)</w:t>
       </w:r>
       <w:r>
         <w:rPr>
@@ -5415,7 +5922,7 @@
           <w:highlight w:val="yellow"/>
         </w:rPr>
         <w:tab/>
-        <w:t>(polish surplus)</w:t>
+        <w:t>(polish slack)</w:t>
       </w:r>
     </w:p>
     <w:p>
@@ -7243,7 +7750,7 @@
           <w:bCs/>
           <w:highlight w:val="yellow"/>
         </w:rPr>
-        <w:t xml:space="preserve">Better profit as 400 is greater that 220+165 = </w:t>
+        <w:t xml:space="preserve">Better profit as 400 is greater than 220+165 = </w:t>
       </w:r>
       <w:r>
         <w:rPr>

</xml_diff>